<commit_message>
Final package: evaluation_v2 with Gemini agent cache, updated paper PDF and README
</commit_message>
<xml_diff>
--- a/CampusInbox_IEEE_Paper_v2_Kareena_Jahagirdar.docx
+++ b/CampusInbox_IEEE_Paper_v2_Kareena_Jahagirdar.docx
@@ -1923,7 +1923,7 @@
           <w:i/>
           <w:sz w:val="19"/>
         </w:rPr>
-        <w:t>I. Not implemented</w:t>
+        <w:t>I. Agent loop, Verifier and message log</w:t>
       </w:r>
     </w:p>
     <w:p>
@@ -1938,7 +1938,97 @@
           <w:i w:val="0"/>
           <w:sz w:val="19"/>
         </w:rPr>
-        <w:t>The app does not log in to Gmail or fetch mail over the network, and does not connect to Google Classroom or WhatsApp; reminders reach only the page and the local notifier; the extractor does not return a confidence score; the quote check requires the quote to occur in the mail but does not require it to contain the date, because relative dates such as "Friday" are resolved against the mail's Date header; a date given without a time is stored as 23:59 IST. A browser-only build of the same design from a written specification (React, local storage) has been specified but not built or tested, and nothing in this paper is measured on it.</w:t>
+        <w:t>In agent mode the Extractor is a tool-using loop in the style of ReAct [1]: a prompted model may call read_header, search_mail, read_context, parse_date and check_quote, and ends with final_answer. The loop is capped at six steps. A deterministic gate then requires the quoted sentence to occur verbatim in the mail and to contain the proposed date; if it does not, the model gets one reflection turn with the failure reason and then the task stays in review. A separate Verifier role runs the same quote check first and, when a model is configured, asks the model for a second verdict. Every hand-off (Intake to Extractor, Extractor to Verifier, Verifier to Reviewer) is stored as a message row with sender, receiver, kind and content, and each tool call is stored in the task trace; the dashboard shows both. Without a model, a scripted run of the same five tools gives a deterministic second opinion on the rule result. No tool can send mail or change a task; the only outputs are proposals that wait for approval. This is a small fixed pipeline of roles, not a general multi-agent framework, and no agent framework library is used.</w:t>
+      </w:r>
+    </w:p>
+    <w:p>
+      <w:pPr>
+        <w:spacing w:after="60" w:before="80"/>
+        <w:jc w:val="left"/>
+      </w:pPr>
+      <w:r>
+        <w:rPr>
+          <w:rFonts w:ascii="Times New Roman" w:hAnsi="Times New Roman"/>
+          <w:b/>
+          <w:i/>
+          <w:sz w:val="19"/>
+        </w:rPr>
+        <w:t>J. Retrieval and the chat panel</w:t>
+      </w:r>
+    </w:p>
+    <w:p>
+      <w:pPr>
+        <w:spacing w:after="80" w:before="0"/>
+        <w:jc w:val="both"/>
+      </w:pPr>
+      <w:r>
+        <w:rPr>
+          <w:rFonts w:ascii="Times New Roman" w:hAnsi="Times New Roman"/>
+          <w:b w:val="0"/>
+          <w:i w:val="0"/>
+          <w:sz w:val="19"/>
+        </w:rPr>
+        <w:t>The chat panel answers only from the imported mails and from the text of the course syllabus (BCE27PE02, Agentic AI Design), using BM25 retrieval over sentences. Questions about the week, conflicts and "why this date" are answered by code from approved tasks. For other questions, the best-matching sentence is shown with its source mail or syllabus section; if no sentence scores above a fixed threshold the reply is "not found". An optional model mode lets a prompted model call search_corpus and read_chunk and finish with an answer that cites chunk ids with verbatim quotes; a gate rejects any answer whose citation is unknown or whose quote is not in the cited chunk. Mail text is passed as data and the chat has no tools that change state. The behaviour is covered by unit tests for a retrieval hit, no answer, an injected instruction inside a mail, a fabricated quote and an unknown source (the model mode is tested with a mocked model; it was not evaluated for answer quality). An optional web mode adds two tools, web_search and fetch_url. It is off unless the user sets CAMPUS_WEB=1 and their own search endpoint (and key); no search service is bundled. The page fetcher accepts only http(s) URLs that a search returned, refuses hosts that resolve to private, loopback or link-local addresses, caps page size, and strips scripts. Search snippets cannot be cited; only sentences of a fetched page can, with verbatim quotes checked by the same gate, and the answer carries a caveats field (for example price or issuer not stated; the prompt asks for "cost unverified" unless a page states it). Page text is treated as untrusted data and the tool set has no send function. Status: the web loop is unit-tested with mocked search and fetch (verified quote, fabricated quote, snippet or unlisted URL, injection inside a page, search failure, private-address block); the page fetcher alone was run once against a public test page; the search backend and the full model-driven web loop were not run live, and the answers have not been evaluated for correctness. Only synthetic and Enron mail were used; the student's own mail was not.</w:t>
+      </w:r>
+    </w:p>
+    <w:p>
+      <w:pPr>
+        <w:spacing w:after="60" w:before="80"/>
+        <w:jc w:val="left"/>
+      </w:pPr>
+      <w:r>
+        <w:rPr>
+          <w:rFonts w:ascii="Times New Roman" w:hAnsi="Times New Roman"/>
+          <w:b/>
+          <w:i/>
+          <w:sz w:val="19"/>
+        </w:rPr>
+        <w:t>K. Priority, conflicts, digest, notifier adapters and Gmail import</w:t>
+      </w:r>
+    </w:p>
+    <w:p>
+      <w:pPr>
+        <w:spacing w:after="80" w:before="0"/>
+        <w:jc w:val="both"/>
+      </w:pPr>
+      <w:r>
+        <w:rPr>
+          <w:rFonts w:ascii="Times New Roman" w:hAnsi="Times New Roman"/>
+          <w:b w:val="0"/>
+          <w:i w:val="0"/>
+          <w:sz w:val="19"/>
+        </w:rPr>
+        <w:t>Approved, unsubmitted tasks are ranked by time to deadline; two approved tasks due within three hours of each other are reported as a conflict; a weekly digest lists both. Reminder delivery goes through adapters: console and file are built and tested; WhatsApp Cloud API and email adapters are implemented as stubs that print what they would send unless the owner sets their own keys and a live flag, and they have not been run against the real services. They send reminders to the owner only. A user-run Gmail import (read-only scope, PKCE loopback login, token stored in a file readable only by the user) is implemented with fake-transport tests and has not been run against a real Gmail account. No Gmail send scope or send code exists.</w:t>
+      </w:r>
+    </w:p>
+    <w:p>
+      <w:pPr>
+        <w:spacing w:after="60" w:before="80"/>
+        <w:jc w:val="left"/>
+      </w:pPr>
+      <w:r>
+        <w:rPr>
+          <w:rFonts w:ascii="Times New Roman" w:hAnsi="Times New Roman"/>
+          <w:b/>
+          <w:i/>
+          <w:sz w:val="19"/>
+        </w:rPr>
+        <w:t>L. Not implemented</w:t>
+      </w:r>
+    </w:p>
+    <w:p>
+      <w:pPr>
+        <w:spacing w:after="80" w:before="0"/>
+        <w:jc w:val="both"/>
+      </w:pPr>
+      <w:r>
+        <w:rPr>
+          <w:rFonts w:ascii="Times New Roman" w:hAnsi="Times New Roman"/>
+          <w:b w:val="0"/>
+          <w:i w:val="0"/>
+          <w:sz w:val="19"/>
+        </w:rPr>
+        <w:t>Gmail import and the WhatsApp and email adapters are not live-tested (Section III-K); the app does not connect to Google Classroom or WhatsApp; reminders reach only the page and the local notifier; the extractor does not return a confidence score; the quote check requires the quote to occur in the mail but does not require it to contain the date, because relative dates such as "Friday" are resolved against the mail's Date header; a date given without a time is stored as 23:59 IST. A browser-only build of the same design from a written specification (React, local storage) has been specified but not built or tested, and nothing in this paper is measured on it.</w:t>
       </w:r>
     </w:p>
     <w:p>
@@ -2853,7 +2943,7 @@
                 <w:b w:val="0"/>
                 <w:sz w:val="15"/>
               </w:rPr>
-              <w:t>Live demo only</w:t>
+              <w:t>Live demo; ReAct agent loop (test subset)</w:t>
             </w:r>
           </w:p>
         </w:tc>
@@ -2966,7 +3056,7 @@
           <w:i w:val="0"/>
           <w:sz w:val="19"/>
         </w:rPr>
-        <w:t>The MVP is a single-file Python 3.10 application using only the standard library: http.server, sqlite3 and a background reminder thread, with a plain black-and-white web UI. No pip install or key is needed for the default offline demo. In this revision the app imports rules_v2, uses the mail's Date header to resolve relative phrases, uses a role-specific model prompt, and applies the agreement gate. There are 28 unit tests, all passing; five were added in this revision (the agreement gate, date handling, the draft check, file import and the local notifier). The evaluation code (build_enron.py, labelling and caching of every model call, run_eval_v2.py, run_adv.py) is in the evaluation_v2 folder; each model response is cached so the scoring can be repeated without any API.</w:t>
+        <w:t>The MVP is a Python 3.10 application (a main module plus agent, retrieval, chat and notifier modules) using only the standard library: http.server, sqlite3 and a background reminder thread, with a plain black-and-white web UI. No pip install or key is needed for the default offline demo. In this revision the app imports rules_v2, uses the mail's Date header to resolve relative phrases, uses a role-specific model prompt, and applies the agreement gate. There are 74 unit tests, all passing; the agent loop, verifier, retrieval, chat, notifier and Gmail-import tests were added in this revision, and earlier additions were (the agreement gate, date handling, the draft check, file import and the local notifier). The evaluation code (build_enron.py, labelling and caching of every model call, run_eval_v2.py, run_adv.py) is in the evaluation_v2 folder; each model response is cached so the scoring can be repeated without any API.</w:t>
       </w:r>
     </w:p>
     <w:p>
@@ -6440,7 +6530,7 @@
                 <w:b w:val="0"/>
                 <w:sz w:val="15"/>
               </w:rPr>
-              <w:t>28</w:t>
+              <w:t>74</w:t>
             </w:r>
           </w:p>
         </w:tc>
@@ -6459,7 +6549,7 @@
                 <w:b w:val="0"/>
                 <w:sz w:val="15"/>
               </w:rPr>
-              <w:t>28 passed</w:t>
+              <w:t>74 passed</w:t>
             </w:r>
           </w:p>
         </w:tc>
@@ -6775,6 +6865,893 @@
     </w:p>
     <w:p>
       <w:pPr>
+        <w:spacing w:after="60" w:before="80"/>
+        <w:jc w:val="left"/>
+      </w:pPr>
+      <w:r>
+        <w:rPr>
+          <w:rFonts w:ascii="Times New Roman" w:hAnsi="Times New Roman"/>
+          <w:b/>
+          <w:i/>
+          <w:sz w:val="19"/>
+        </w:rPr>
+        <w:t>I. Agent-loop smoke test on 12 test mails (not a result)</w:t>
+      </w:r>
+    </w:p>
+    <w:p>
+      <w:pPr>
+        <w:spacing w:after="40" w:before="60"/>
+        <w:jc w:val="center"/>
+      </w:pPr>
+      <w:r>
+        <w:rPr>
+          <w:rFonts w:ascii="Times New Roman" w:hAnsi="Times New Roman"/>
+          <w:b w:val="0"/>
+          <w:i w:val="0"/>
+          <w:sz w:val="17"/>
+        </w:rPr>
+        <w:t>TABLE XIII</w:t>
+        <w:br/>
+        <w:t>AGENT-LOOP SYSTEMS ON 12 OF 178 TEST MAILS (7 SILVER POSITIVES; RANDOM SUBSET, SEED 20261020)</w:t>
+      </w:r>
+    </w:p>
+    <w:tbl>
+      <w:tblPr>
+        <w:tblStyle w:val="TableGrid"/>
+        <w:jc w:val="center"/>
+        <w:tblLayout w:type="fixed"/>
+        <w:tblLook w:firstColumn="1" w:firstRow="1" w:lastColumn="0" w:lastRow="0" w:noHBand="0" w:noVBand="1" w:val="04A0"/>
+        <w:tblLayout w:type="fixed"/>
+        <w:tblCellMar>
+          <w:left w:w="40" w:type="dxa"/>
+          <w:right w:w="40" w:type="dxa"/>
+        </w:tblCellMar>
+        <w:tblW w:w="4823" w:type="dxa"/>
+      </w:tblPr>
+      <w:tblGrid>
+        <w:gridCol w:w="2232"/>
+        <w:gridCol w:w="432"/>
+        <w:gridCol w:w="432"/>
+        <w:gridCol w:w="576"/>
+        <w:gridCol w:w="576"/>
+        <w:gridCol w:w="576"/>
+      </w:tblGrid>
+      <w:tr>
+        <w:tc>
+          <w:tcPr>
+            <w:tcW w:type="dxa" w:w="2232"/>
+          </w:tcPr>
+          <w:p>
+            <w:pPr>
+              <w:spacing w:after="0"/>
+              <w:jc w:val="left"/>
+            </w:pPr>
+            <w:r>
+              <w:rPr>
+                <w:rFonts w:ascii="Times New Roman" w:hAnsi="Times New Roman"/>
+                <w:b/>
+                <w:sz w:val="15"/>
+              </w:rPr>
+              <w:t>System</w:t>
+            </w:r>
+          </w:p>
+        </w:tc>
+        <w:tc>
+          <w:tcPr>
+            <w:tcW w:type="dxa" w:w="432"/>
+          </w:tcPr>
+          <w:p>
+            <w:pPr>
+              <w:spacing w:after="0"/>
+              <w:jc w:val="center"/>
+            </w:pPr>
+            <w:r>
+              <w:rPr>
+                <w:rFonts w:ascii="Times New Roman" w:hAnsi="Times New Roman"/>
+                <w:b/>
+                <w:sz w:val="15"/>
+              </w:rPr>
+              <w:t>Out</w:t>
+            </w:r>
+          </w:p>
+        </w:tc>
+        <w:tc>
+          <w:tcPr>
+            <w:tcW w:type="dxa" w:w="432"/>
+          </w:tcPr>
+          <w:p>
+            <w:pPr>
+              <w:spacing w:after="0"/>
+              <w:jc w:val="center"/>
+            </w:pPr>
+            <w:r>
+              <w:rPr>
+                <w:rFonts w:ascii="Times New Roman" w:hAnsi="Times New Roman"/>
+                <w:b/>
+                <w:sz w:val="15"/>
+              </w:rPr>
+              <w:t>OK</w:t>
+            </w:r>
+          </w:p>
+        </w:tc>
+        <w:tc>
+          <w:tcPr>
+            <w:tcW w:type="dxa" w:w="576"/>
+          </w:tcPr>
+          <w:p>
+            <w:pPr>
+              <w:spacing w:after="0"/>
+              <w:jc w:val="center"/>
+            </w:pPr>
+            <w:r>
+              <w:rPr>
+                <w:rFonts w:ascii="Times New Roman" w:hAnsi="Times New Roman"/>
+                <w:b/>
+                <w:sz w:val="15"/>
+              </w:rPr>
+              <w:t>Wrong</w:t>
+            </w:r>
+          </w:p>
+        </w:tc>
+        <w:tc>
+          <w:tcPr>
+            <w:tcW w:type="dxa" w:w="576"/>
+          </w:tcPr>
+          <w:p>
+            <w:pPr>
+              <w:spacing w:after="0"/>
+              <w:jc w:val="center"/>
+            </w:pPr>
+            <w:r>
+              <w:rPr>
+                <w:rFonts w:ascii="Times New Roman" w:hAnsi="Times New Roman"/>
+                <w:b/>
+                <w:sz w:val="15"/>
+              </w:rPr>
+              <w:t>P %</w:t>
+            </w:r>
+          </w:p>
+        </w:tc>
+        <w:tc>
+          <w:tcPr>
+            <w:tcW w:type="dxa" w:w="576"/>
+          </w:tcPr>
+          <w:p>
+            <w:pPr>
+              <w:spacing w:after="0"/>
+              <w:jc w:val="center"/>
+            </w:pPr>
+            <w:r>
+              <w:rPr>
+                <w:rFonts w:ascii="Times New Roman" w:hAnsi="Times New Roman"/>
+                <w:b/>
+                <w:sz w:val="15"/>
+              </w:rPr>
+              <w:t>R %</w:t>
+            </w:r>
+          </w:p>
+        </w:tc>
+      </w:tr>
+      <w:tr>
+        <w:tc>
+          <w:tcPr>
+            <w:tcW w:type="dxa" w:w="2232"/>
+          </w:tcPr>
+          <w:p>
+            <w:pPr>
+              <w:spacing w:after="0"/>
+              <w:jc w:val="left"/>
+            </w:pPr>
+            <w:r>
+              <w:rPr>
+                <w:rFonts w:ascii="Times New Roman" w:hAnsi="Times New Roman"/>
+                <w:b w:val="0"/>
+                <w:sz w:val="15"/>
+              </w:rPr>
+              <w:t>Rules (frozen)</w:t>
+            </w:r>
+          </w:p>
+        </w:tc>
+        <w:tc>
+          <w:tcPr>
+            <w:tcW w:type="dxa" w:w="432"/>
+          </w:tcPr>
+          <w:p>
+            <w:pPr>
+              <w:spacing w:after="0"/>
+              <w:jc w:val="center"/>
+            </w:pPr>
+            <w:r>
+              <w:rPr>
+                <w:rFonts w:ascii="Times New Roman" w:hAnsi="Times New Roman"/>
+                <w:b w:val="0"/>
+                <w:sz w:val="15"/>
+              </w:rPr>
+              <w:t>6</w:t>
+            </w:r>
+          </w:p>
+        </w:tc>
+        <w:tc>
+          <w:tcPr>
+            <w:tcW w:type="dxa" w:w="432"/>
+          </w:tcPr>
+          <w:p>
+            <w:pPr>
+              <w:spacing w:after="0"/>
+              <w:jc w:val="center"/>
+            </w:pPr>
+            <w:r>
+              <w:rPr>
+                <w:rFonts w:ascii="Times New Roman" w:hAnsi="Times New Roman"/>
+                <w:b w:val="0"/>
+                <w:sz w:val="15"/>
+              </w:rPr>
+              <w:t>6</w:t>
+            </w:r>
+          </w:p>
+        </w:tc>
+        <w:tc>
+          <w:tcPr>
+            <w:tcW w:type="dxa" w:w="576"/>
+          </w:tcPr>
+          <w:p>
+            <w:pPr>
+              <w:spacing w:after="0"/>
+              <w:jc w:val="center"/>
+            </w:pPr>
+            <w:r>
+              <w:rPr>
+                <w:rFonts w:ascii="Times New Roman" w:hAnsi="Times New Roman"/>
+                <w:b w:val="0"/>
+                <w:sz w:val="15"/>
+              </w:rPr>
+              <w:t>0</w:t>
+            </w:r>
+          </w:p>
+        </w:tc>
+        <w:tc>
+          <w:tcPr>
+            <w:tcW w:type="dxa" w:w="576"/>
+          </w:tcPr>
+          <w:p>
+            <w:pPr>
+              <w:spacing w:after="0"/>
+              <w:jc w:val="center"/>
+            </w:pPr>
+            <w:r>
+              <w:rPr>
+                <w:rFonts w:ascii="Times New Roman" w:hAnsi="Times New Roman"/>
+                <w:b w:val="0"/>
+                <w:sz w:val="15"/>
+              </w:rPr>
+              <w:t>100.0</w:t>
+            </w:r>
+          </w:p>
+        </w:tc>
+        <w:tc>
+          <w:tcPr>
+            <w:tcW w:type="dxa" w:w="576"/>
+          </w:tcPr>
+          <w:p>
+            <w:pPr>
+              <w:spacing w:after="0"/>
+              <w:jc w:val="center"/>
+            </w:pPr>
+            <w:r>
+              <w:rPr>
+                <w:rFonts w:ascii="Times New Roman" w:hAnsi="Times New Roman"/>
+                <w:b w:val="0"/>
+                <w:sz w:val="15"/>
+              </w:rPr>
+              <w:t>85.7</w:t>
+            </w:r>
+          </w:p>
+        </w:tc>
+      </w:tr>
+      <w:tr>
+        <w:tc>
+          <w:tcPr>
+            <w:tcW w:type="dxa" w:w="2232"/>
+          </w:tcPr>
+          <w:p>
+            <w:pPr>
+              <w:spacing w:after="0"/>
+              <w:jc w:val="left"/>
+            </w:pPr>
+            <w:r>
+              <w:rPr>
+                <w:rFonts w:ascii="Times New Roman" w:hAnsi="Times New Roman"/>
+                <w:b w:val="0"/>
+                <w:sz w:val="15"/>
+              </w:rPr>
+              <w:t>LLM + quote check</w:t>
+            </w:r>
+          </w:p>
+        </w:tc>
+        <w:tc>
+          <w:tcPr>
+            <w:tcW w:type="dxa" w:w="432"/>
+          </w:tcPr>
+          <w:p>
+            <w:pPr>
+              <w:spacing w:after="0"/>
+              <w:jc w:val="center"/>
+            </w:pPr>
+            <w:r>
+              <w:rPr>
+                <w:rFonts w:ascii="Times New Roman" w:hAnsi="Times New Roman"/>
+                <w:b w:val="0"/>
+                <w:sz w:val="15"/>
+              </w:rPr>
+              <w:t>8</w:t>
+            </w:r>
+          </w:p>
+        </w:tc>
+        <w:tc>
+          <w:tcPr>
+            <w:tcW w:type="dxa" w:w="432"/>
+          </w:tcPr>
+          <w:p>
+            <w:pPr>
+              <w:spacing w:after="0"/>
+              <w:jc w:val="center"/>
+            </w:pPr>
+            <w:r>
+              <w:rPr>
+                <w:rFonts w:ascii="Times New Roman" w:hAnsi="Times New Roman"/>
+                <w:b w:val="0"/>
+                <w:sz w:val="15"/>
+              </w:rPr>
+              <w:t>7</w:t>
+            </w:r>
+          </w:p>
+        </w:tc>
+        <w:tc>
+          <w:tcPr>
+            <w:tcW w:type="dxa" w:w="576"/>
+          </w:tcPr>
+          <w:p>
+            <w:pPr>
+              <w:spacing w:after="0"/>
+              <w:jc w:val="center"/>
+            </w:pPr>
+            <w:r>
+              <w:rPr>
+                <w:rFonts w:ascii="Times New Roman" w:hAnsi="Times New Roman"/>
+                <w:b w:val="0"/>
+                <w:sz w:val="15"/>
+              </w:rPr>
+              <w:t>1</w:t>
+            </w:r>
+          </w:p>
+        </w:tc>
+        <w:tc>
+          <w:tcPr>
+            <w:tcW w:type="dxa" w:w="576"/>
+          </w:tcPr>
+          <w:p>
+            <w:pPr>
+              <w:spacing w:after="0"/>
+              <w:jc w:val="center"/>
+            </w:pPr>
+            <w:r>
+              <w:rPr>
+                <w:rFonts w:ascii="Times New Roman" w:hAnsi="Times New Roman"/>
+                <w:b w:val="0"/>
+                <w:sz w:val="15"/>
+              </w:rPr>
+              <w:t>87.5</w:t>
+            </w:r>
+          </w:p>
+        </w:tc>
+        <w:tc>
+          <w:tcPr>
+            <w:tcW w:type="dxa" w:w="576"/>
+          </w:tcPr>
+          <w:p>
+            <w:pPr>
+              <w:spacing w:after="0"/>
+              <w:jc w:val="center"/>
+            </w:pPr>
+            <w:r>
+              <w:rPr>
+                <w:rFonts w:ascii="Times New Roman" w:hAnsi="Times New Roman"/>
+                <w:b w:val="0"/>
+                <w:sz w:val="15"/>
+              </w:rPr>
+              <w:t>100.0</w:t>
+            </w:r>
+          </w:p>
+        </w:tc>
+      </w:tr>
+      <w:tr>
+        <w:tc>
+          <w:tcPr>
+            <w:tcW w:type="dxa" w:w="2232"/>
+          </w:tcPr>
+          <w:p>
+            <w:pPr>
+              <w:spacing w:after="0"/>
+              <w:jc w:val="left"/>
+            </w:pPr>
+            <w:r>
+              <w:rPr>
+                <w:rFonts w:ascii="Times New Roman" w:hAnsi="Times New Roman"/>
+                <w:b w:val="0"/>
+                <w:sz w:val="15"/>
+              </w:rPr>
+              <w:t>Scripted tool run (no model)</w:t>
+            </w:r>
+          </w:p>
+        </w:tc>
+        <w:tc>
+          <w:tcPr>
+            <w:tcW w:type="dxa" w:w="432"/>
+          </w:tcPr>
+          <w:p>
+            <w:pPr>
+              <w:spacing w:after="0"/>
+              <w:jc w:val="center"/>
+            </w:pPr>
+            <w:r>
+              <w:rPr>
+                <w:rFonts w:ascii="Times New Roman" w:hAnsi="Times New Roman"/>
+                <w:b w:val="0"/>
+                <w:sz w:val="15"/>
+              </w:rPr>
+              <w:t>6</w:t>
+            </w:r>
+          </w:p>
+        </w:tc>
+        <w:tc>
+          <w:tcPr>
+            <w:tcW w:type="dxa" w:w="432"/>
+          </w:tcPr>
+          <w:p>
+            <w:pPr>
+              <w:spacing w:after="0"/>
+              <w:jc w:val="center"/>
+            </w:pPr>
+            <w:r>
+              <w:rPr>
+                <w:rFonts w:ascii="Times New Roman" w:hAnsi="Times New Roman"/>
+                <w:b w:val="0"/>
+                <w:sz w:val="15"/>
+              </w:rPr>
+              <w:t>6</w:t>
+            </w:r>
+          </w:p>
+        </w:tc>
+        <w:tc>
+          <w:tcPr>
+            <w:tcW w:type="dxa" w:w="576"/>
+          </w:tcPr>
+          <w:p>
+            <w:pPr>
+              <w:spacing w:after="0"/>
+              <w:jc w:val="center"/>
+            </w:pPr>
+            <w:r>
+              <w:rPr>
+                <w:rFonts w:ascii="Times New Roman" w:hAnsi="Times New Roman"/>
+                <w:b w:val="0"/>
+                <w:sz w:val="15"/>
+              </w:rPr>
+              <w:t>0</w:t>
+            </w:r>
+          </w:p>
+        </w:tc>
+        <w:tc>
+          <w:tcPr>
+            <w:tcW w:type="dxa" w:w="576"/>
+          </w:tcPr>
+          <w:p>
+            <w:pPr>
+              <w:spacing w:after="0"/>
+              <w:jc w:val="center"/>
+            </w:pPr>
+            <w:r>
+              <w:rPr>
+                <w:rFonts w:ascii="Times New Roman" w:hAnsi="Times New Roman"/>
+                <w:b w:val="0"/>
+                <w:sz w:val="15"/>
+              </w:rPr>
+              <w:t>100.0</w:t>
+            </w:r>
+          </w:p>
+        </w:tc>
+        <w:tc>
+          <w:tcPr>
+            <w:tcW w:type="dxa" w:w="576"/>
+          </w:tcPr>
+          <w:p>
+            <w:pPr>
+              <w:spacing w:after="0"/>
+              <w:jc w:val="center"/>
+            </w:pPr>
+            <w:r>
+              <w:rPr>
+                <w:rFonts w:ascii="Times New Roman" w:hAnsi="Times New Roman"/>
+                <w:b w:val="0"/>
+                <w:sz w:val="15"/>
+              </w:rPr>
+              <w:t>85.7</w:t>
+            </w:r>
+          </w:p>
+        </w:tc>
+      </w:tr>
+      <w:tr>
+        <w:tc>
+          <w:tcPr>
+            <w:tcW w:type="dxa" w:w="2232"/>
+          </w:tcPr>
+          <w:p>
+            <w:pPr>
+              <w:spacing w:after="0"/>
+              <w:jc w:val="left"/>
+            </w:pPr>
+            <w:r>
+              <w:rPr>
+                <w:rFonts w:ascii="Times New Roman" w:hAnsi="Times New Roman"/>
+                <w:b w:val="0"/>
+                <w:sz w:val="15"/>
+              </w:rPr>
+              <w:t>ReAct agent + quote gate</w:t>
+            </w:r>
+          </w:p>
+        </w:tc>
+        <w:tc>
+          <w:tcPr>
+            <w:tcW w:type="dxa" w:w="432"/>
+          </w:tcPr>
+          <w:p>
+            <w:pPr>
+              <w:spacing w:after="0"/>
+              <w:jc w:val="center"/>
+            </w:pPr>
+            <w:r>
+              <w:rPr>
+                <w:rFonts w:ascii="Times New Roman" w:hAnsi="Times New Roman"/>
+                <w:b w:val="0"/>
+                <w:sz w:val="15"/>
+              </w:rPr>
+              <w:t>7</w:t>
+            </w:r>
+          </w:p>
+        </w:tc>
+        <w:tc>
+          <w:tcPr>
+            <w:tcW w:type="dxa" w:w="432"/>
+          </w:tcPr>
+          <w:p>
+            <w:pPr>
+              <w:spacing w:after="0"/>
+              <w:jc w:val="center"/>
+            </w:pPr>
+            <w:r>
+              <w:rPr>
+                <w:rFonts w:ascii="Times New Roman" w:hAnsi="Times New Roman"/>
+                <w:b w:val="0"/>
+                <w:sz w:val="15"/>
+              </w:rPr>
+              <w:t>7</w:t>
+            </w:r>
+          </w:p>
+        </w:tc>
+        <w:tc>
+          <w:tcPr>
+            <w:tcW w:type="dxa" w:w="576"/>
+          </w:tcPr>
+          <w:p>
+            <w:pPr>
+              <w:spacing w:after="0"/>
+              <w:jc w:val="center"/>
+            </w:pPr>
+            <w:r>
+              <w:rPr>
+                <w:rFonts w:ascii="Times New Roman" w:hAnsi="Times New Roman"/>
+                <w:b w:val="0"/>
+                <w:sz w:val="15"/>
+              </w:rPr>
+              <w:t>0</w:t>
+            </w:r>
+          </w:p>
+        </w:tc>
+        <w:tc>
+          <w:tcPr>
+            <w:tcW w:type="dxa" w:w="576"/>
+          </w:tcPr>
+          <w:p>
+            <w:pPr>
+              <w:spacing w:after="0"/>
+              <w:jc w:val="center"/>
+            </w:pPr>
+            <w:r>
+              <w:rPr>
+                <w:rFonts w:ascii="Times New Roman" w:hAnsi="Times New Roman"/>
+                <w:b w:val="0"/>
+                <w:sz w:val="15"/>
+              </w:rPr>
+              <w:t>100.0</w:t>
+            </w:r>
+          </w:p>
+        </w:tc>
+        <w:tc>
+          <w:tcPr>
+            <w:tcW w:type="dxa" w:w="576"/>
+          </w:tcPr>
+          <w:p>
+            <w:pPr>
+              <w:spacing w:after="0"/>
+              <w:jc w:val="center"/>
+            </w:pPr>
+            <w:r>
+              <w:rPr>
+                <w:rFonts w:ascii="Times New Roman" w:hAnsi="Times New Roman"/>
+                <w:b w:val="0"/>
+                <w:sz w:val="15"/>
+              </w:rPr>
+              <w:t>100.0</w:t>
+            </w:r>
+          </w:p>
+        </w:tc>
+      </w:tr>
+      <w:tr>
+        <w:tc>
+          <w:tcPr>
+            <w:tcW w:type="dxa" w:w="2232"/>
+          </w:tcPr>
+          <w:p>
+            <w:pPr>
+              <w:spacing w:after="0"/>
+              <w:jc w:val="left"/>
+            </w:pPr>
+            <w:r>
+              <w:rPr>
+                <w:rFonts w:ascii="Times New Roman" w:hAnsi="Times New Roman"/>
+                <w:b w:val="0"/>
+                <w:sz w:val="15"/>
+              </w:rPr>
+              <w:t>ReAct agent agrees with rules</w:t>
+            </w:r>
+          </w:p>
+        </w:tc>
+        <w:tc>
+          <w:tcPr>
+            <w:tcW w:type="dxa" w:w="432"/>
+          </w:tcPr>
+          <w:p>
+            <w:pPr>
+              <w:spacing w:after="0"/>
+              <w:jc w:val="center"/>
+            </w:pPr>
+            <w:r>
+              <w:rPr>
+                <w:rFonts w:ascii="Times New Roman" w:hAnsi="Times New Roman"/>
+                <w:b w:val="0"/>
+                <w:sz w:val="15"/>
+              </w:rPr>
+              <w:t>6</w:t>
+            </w:r>
+          </w:p>
+        </w:tc>
+        <w:tc>
+          <w:tcPr>
+            <w:tcW w:type="dxa" w:w="432"/>
+          </w:tcPr>
+          <w:p>
+            <w:pPr>
+              <w:spacing w:after="0"/>
+              <w:jc w:val="center"/>
+            </w:pPr>
+            <w:r>
+              <w:rPr>
+                <w:rFonts w:ascii="Times New Roman" w:hAnsi="Times New Roman"/>
+                <w:b w:val="0"/>
+                <w:sz w:val="15"/>
+              </w:rPr>
+              <w:t>6</w:t>
+            </w:r>
+          </w:p>
+        </w:tc>
+        <w:tc>
+          <w:tcPr>
+            <w:tcW w:type="dxa" w:w="576"/>
+          </w:tcPr>
+          <w:p>
+            <w:pPr>
+              <w:spacing w:after="0"/>
+              <w:jc w:val="center"/>
+            </w:pPr>
+            <w:r>
+              <w:rPr>
+                <w:rFonts w:ascii="Times New Roman" w:hAnsi="Times New Roman"/>
+                <w:b w:val="0"/>
+                <w:sz w:val="15"/>
+              </w:rPr>
+              <w:t>0</w:t>
+            </w:r>
+          </w:p>
+        </w:tc>
+        <w:tc>
+          <w:tcPr>
+            <w:tcW w:type="dxa" w:w="576"/>
+          </w:tcPr>
+          <w:p>
+            <w:pPr>
+              <w:spacing w:after="0"/>
+              <w:jc w:val="center"/>
+            </w:pPr>
+            <w:r>
+              <w:rPr>
+                <w:rFonts w:ascii="Times New Roman" w:hAnsi="Times New Roman"/>
+                <w:b w:val="0"/>
+                <w:sz w:val="15"/>
+              </w:rPr>
+              <w:t>100.0</w:t>
+            </w:r>
+          </w:p>
+        </w:tc>
+        <w:tc>
+          <w:tcPr>
+            <w:tcW w:type="dxa" w:w="576"/>
+          </w:tcPr>
+          <w:p>
+            <w:pPr>
+              <w:spacing w:after="0"/>
+              <w:jc w:val="center"/>
+            </w:pPr>
+            <w:r>
+              <w:rPr>
+                <w:rFonts w:ascii="Times New Roman" w:hAnsi="Times New Roman"/>
+                <w:b w:val="0"/>
+                <w:sz w:val="15"/>
+              </w:rPr>
+              <w:t>85.7</w:t>
+            </w:r>
+          </w:p>
+        </w:tc>
+      </w:tr>
+      <w:tr>
+        <w:tc>
+          <w:tcPr>
+            <w:tcW w:type="dxa" w:w="2232"/>
+          </w:tcPr>
+          <w:p>
+            <w:pPr>
+              <w:spacing w:after="0"/>
+              <w:jc w:val="left"/>
+            </w:pPr>
+            <w:r>
+              <w:rPr>
+                <w:rFonts w:ascii="Times New Roman" w:hAnsi="Times New Roman"/>
+                <w:b w:val="0"/>
+                <w:sz w:val="15"/>
+              </w:rPr>
+              <w:t>LLM + Verifier role</w:t>
+            </w:r>
+          </w:p>
+        </w:tc>
+        <w:tc>
+          <w:tcPr>
+            <w:tcW w:type="dxa" w:w="432"/>
+          </w:tcPr>
+          <w:p>
+            <w:pPr>
+              <w:spacing w:after="0"/>
+              <w:jc w:val="center"/>
+            </w:pPr>
+            <w:r>
+              <w:rPr>
+                <w:rFonts w:ascii="Times New Roman" w:hAnsi="Times New Roman"/>
+                <w:b w:val="0"/>
+                <w:sz w:val="15"/>
+              </w:rPr>
+              <w:t>6</w:t>
+            </w:r>
+          </w:p>
+        </w:tc>
+        <w:tc>
+          <w:tcPr>
+            <w:tcW w:type="dxa" w:w="432"/>
+          </w:tcPr>
+          <w:p>
+            <w:pPr>
+              <w:spacing w:after="0"/>
+              <w:jc w:val="center"/>
+            </w:pPr>
+            <w:r>
+              <w:rPr>
+                <w:rFonts w:ascii="Times New Roman" w:hAnsi="Times New Roman"/>
+                <w:b w:val="0"/>
+                <w:sz w:val="15"/>
+              </w:rPr>
+              <w:t>6</w:t>
+            </w:r>
+          </w:p>
+        </w:tc>
+        <w:tc>
+          <w:tcPr>
+            <w:tcW w:type="dxa" w:w="576"/>
+          </w:tcPr>
+          <w:p>
+            <w:pPr>
+              <w:spacing w:after="0"/>
+              <w:jc w:val="center"/>
+            </w:pPr>
+            <w:r>
+              <w:rPr>
+                <w:rFonts w:ascii="Times New Roman" w:hAnsi="Times New Roman"/>
+                <w:b w:val="0"/>
+                <w:sz w:val="15"/>
+              </w:rPr>
+              <w:t>0</w:t>
+            </w:r>
+          </w:p>
+        </w:tc>
+        <w:tc>
+          <w:tcPr>
+            <w:tcW w:type="dxa" w:w="576"/>
+          </w:tcPr>
+          <w:p>
+            <w:pPr>
+              <w:spacing w:after="0"/>
+              <w:jc w:val="center"/>
+            </w:pPr>
+            <w:r>
+              <w:rPr>
+                <w:rFonts w:ascii="Times New Roman" w:hAnsi="Times New Roman"/>
+                <w:b w:val="0"/>
+                <w:sz w:val="15"/>
+              </w:rPr>
+              <w:t>100.0</w:t>
+            </w:r>
+          </w:p>
+        </w:tc>
+        <w:tc>
+          <w:tcPr>
+            <w:tcW w:type="dxa" w:w="576"/>
+          </w:tcPr>
+          <w:p>
+            <w:pPr>
+              <w:spacing w:after="0"/>
+              <w:jc w:val="center"/>
+            </w:pPr>
+            <w:r>
+              <w:rPr>
+                <w:rFonts w:ascii="Times New Roman" w:hAnsi="Times New Roman"/>
+                <w:b w:val="0"/>
+                <w:sz w:val="15"/>
+              </w:rPr>
+              <w:t>85.7</w:t>
+            </w:r>
+          </w:p>
+        </w:tc>
+      </w:tr>
+    </w:tbl>
+    <w:p>
+      <w:pPr>
+        <w:spacing w:after="60" w:before="0"/>
+        <w:jc w:val="both"/>
+      </w:pPr>
+    </w:p>
+    <w:p>
+      <w:pPr>
+        <w:spacing w:after="80" w:before="0"/>
+        <w:jc w:val="both"/>
+      </w:pPr>
+      <w:r>
+        <w:rPr>
+          <w:rFonts w:ascii="Times New Roman" w:hAnsi="Times New Roman"/>
+          <w:b w:val="0"/>
+          <w:i w:val="0"/>
+          <w:sz w:val="19"/>
+        </w:rPr>
+        <w:t>The ReAct agent uses prompted gemini-3.1-flash-lite through native tool calls (mean 5.67 steps per mail). We first planned gpt-oss-20b, but its free-tier daily token cap ran out before any test mail was scored, so no test result exists for it; a 6-mail dev smoke test with it worked. The agent model is not from the labellers' families. The rows Rules, LLM + quote check and the answers checked by the Verifier reuse the gpt-oss-20b outputs of the main evaluation (the Verifier call itself uses gemini-3.1-flash-lite), scored on the same subset; only the ReAct rows come from the Gemini agent loop, so the comparison mixes two models and is not a clean test of the loop. All systems are scored on the same 12 mails, chosen by a fixed random seed before any result was seen; only the first batch of 12 mails completed before the deadline (slow free-tier API calls, and the first model's daily cap), so this is a smoke test on a very small subset, not an evaluation. Differences between rows are one or two mails and support no conclusion; the table shows only that the loop runs end to end on public mail with the gate in place. Prompts and code were frozen on a 6-mail smoke test before the run; no tuning used the test split. Where the model returned a malformed function call it was mapped to final_answer and logged. Table XIII is not a benchmark result and is not used in the conclusions.</w:t>
+      </w:r>
+    </w:p>
+    <w:p>
+      <w:pPr>
         <w:spacing w:after="80" w:before="180"/>
         <w:jc w:val="left"/>
       </w:pPr>
@@ -6800,7 +7777,7 @@
           <w:i w:val="0"/>
           <w:sz w:val="17"/>
         </w:rPr>
-        <w:t>TABLE XIII</w:t>
+        <w:t>TABLE XIV</w:t>
         <w:br/>
         <w:t>FEATURE COMPARISON (FROM VENDOR HELP PAGES [10]-[12])</w:t>
       </w:r>
@@ -7758,7 +8735,610 @@
           <w:i w:val="0"/>
           <w:sz w:val="20"/>
         </w:rPr>
-        <w:t>IX. REAL-WORLD USE</w:t>
+        <w:t>IX. RISK AND THREAT MODEL</w:t>
+      </w:r>
+    </w:p>
+    <w:p>
+      <w:pPr>
+        <w:spacing w:after="40" w:before="60"/>
+        <w:jc w:val="center"/>
+      </w:pPr>
+      <w:r>
+        <w:rPr>
+          <w:rFonts w:ascii="Times New Roman" w:hAnsi="Times New Roman"/>
+          <w:b w:val="0"/>
+          <w:i w:val="0"/>
+          <w:sz w:val="17"/>
+        </w:rPr>
+        <w:t>TABLE XV</w:t>
+        <w:br/>
+        <w:t>RISKS AND MITIGATIONS</w:t>
+      </w:r>
+    </w:p>
+    <w:tbl>
+      <w:tblPr>
+        <w:tblStyle w:val="TableGrid"/>
+        <w:jc w:val="center"/>
+        <w:tblLayout w:type="fixed"/>
+        <w:tblLook w:firstColumn="1" w:firstRow="1" w:lastColumn="0" w:lastRow="0" w:noHBand="0" w:noVBand="1" w:val="04A0"/>
+        <w:tblLayout w:type="fixed"/>
+        <w:tblCellMar>
+          <w:left w:w="40" w:type="dxa"/>
+          <w:right w:w="40" w:type="dxa"/>
+        </w:tblCellMar>
+        <w:tblW w:w="4823" w:type="dxa"/>
+      </w:tblPr>
+      <w:tblGrid>
+        <w:gridCol w:w="1296"/>
+        <w:gridCol w:w="2376"/>
+        <w:gridCol w:w="1152"/>
+      </w:tblGrid>
+      <w:tr>
+        <w:tc>
+          <w:tcPr>
+            <w:tcW w:type="dxa" w:w="1296"/>
+          </w:tcPr>
+          <w:p>
+            <w:pPr>
+              <w:spacing w:after="0"/>
+              <w:jc w:val="left"/>
+            </w:pPr>
+            <w:r>
+              <w:rPr>
+                <w:rFonts w:ascii="Times New Roman" w:hAnsi="Times New Roman"/>
+                <w:b/>
+                <w:sz w:val="15"/>
+              </w:rPr>
+              <w:t>Risk</w:t>
+            </w:r>
+          </w:p>
+        </w:tc>
+        <w:tc>
+          <w:tcPr>
+            <w:tcW w:type="dxa" w:w="2376"/>
+          </w:tcPr>
+          <w:p>
+            <w:pPr>
+              <w:spacing w:after="0"/>
+              <w:jc w:val="center"/>
+            </w:pPr>
+            <w:r>
+              <w:rPr>
+                <w:rFonts w:ascii="Times New Roman" w:hAnsi="Times New Roman"/>
+                <w:b/>
+                <w:sz w:val="15"/>
+              </w:rPr>
+              <w:t>Mitigation in code</w:t>
+            </w:r>
+          </w:p>
+        </w:tc>
+        <w:tc>
+          <w:tcPr>
+            <w:tcW w:type="dxa" w:w="1152"/>
+          </w:tcPr>
+          <w:p>
+            <w:pPr>
+              <w:spacing w:after="0"/>
+              <w:jc w:val="center"/>
+            </w:pPr>
+            <w:r>
+              <w:rPr>
+                <w:rFonts w:ascii="Times New Roman" w:hAnsi="Times New Roman"/>
+                <w:b/>
+                <w:sz w:val="15"/>
+              </w:rPr>
+              <w:t>Status</w:t>
+            </w:r>
+          </w:p>
+        </w:tc>
+      </w:tr>
+      <w:tr>
+        <w:tc>
+          <w:tcPr>
+            <w:tcW w:type="dxa" w:w="1296"/>
+          </w:tcPr>
+          <w:p>
+            <w:pPr>
+              <w:spacing w:after="0"/>
+              <w:jc w:val="left"/>
+            </w:pPr>
+            <w:r>
+              <w:rPr>
+                <w:rFonts w:ascii="Times New Roman" w:hAnsi="Times New Roman"/>
+                <w:b w:val="0"/>
+                <w:sz w:val="15"/>
+              </w:rPr>
+              <w:t>Prompt injection in a mail</w:t>
+            </w:r>
+          </w:p>
+        </w:tc>
+        <w:tc>
+          <w:tcPr>
+            <w:tcW w:type="dxa" w:w="2376"/>
+          </w:tcPr>
+          <w:p>
+            <w:pPr>
+              <w:spacing w:after="0"/>
+              <w:jc w:val="center"/>
+            </w:pPr>
+            <w:r>
+              <w:rPr>
+                <w:rFonts w:ascii="Times New Roman" w:hAnsi="Times New Roman"/>
+                <w:b w:val="0"/>
+                <w:sz w:val="15"/>
+              </w:rPr>
+              <w:t>Mail treated as data; quote must contain date; human approves every date; chat has no state-changing tools</w:t>
+            </w:r>
+          </w:p>
+        </w:tc>
+        <w:tc>
+          <w:tcPr>
+            <w:tcW w:type="dxa" w:w="1152"/>
+          </w:tcPr>
+          <w:p>
+            <w:pPr>
+              <w:spacing w:after="0"/>
+              <w:jc w:val="center"/>
+            </w:pPr>
+            <w:r>
+              <w:rPr>
+                <w:rFonts w:ascii="Times New Roman" w:hAnsi="Times New Roman"/>
+                <w:b w:val="0"/>
+                <w:sz w:val="15"/>
+              </w:rPr>
+              <w:t>Built, tested; see the injection test: negative result</w:t>
+            </w:r>
+          </w:p>
+        </w:tc>
+      </w:tr>
+      <w:tr>
+        <w:tc>
+          <w:tcPr>
+            <w:tcW w:type="dxa" w:w="1296"/>
+          </w:tcPr>
+          <w:p>
+            <w:pPr>
+              <w:spacing w:after="0"/>
+              <w:jc w:val="left"/>
+            </w:pPr>
+            <w:r>
+              <w:rPr>
+                <w:rFonts w:ascii="Times New Roman" w:hAnsi="Times New Roman"/>
+                <w:b w:val="0"/>
+                <w:sz w:val="15"/>
+              </w:rPr>
+              <w:t>Wrong deadline causes harm</w:t>
+            </w:r>
+          </w:p>
+        </w:tc>
+        <w:tc>
+          <w:tcPr>
+            <w:tcW w:type="dxa" w:w="2376"/>
+          </w:tcPr>
+          <w:p>
+            <w:pPr>
+              <w:spacing w:after="0"/>
+              <w:jc w:val="center"/>
+            </w:pPr>
+            <w:r>
+              <w:rPr>
+                <w:rFonts w:ascii="Times New Roman" w:hAnsi="Times New Roman"/>
+                <w:b w:val="0"/>
+                <w:sz w:val="15"/>
+              </w:rPr>
+              <w:t>Unknown stays unknown; review gate; agreement gate option</w:t>
+            </w:r>
+          </w:p>
+        </w:tc>
+        <w:tc>
+          <w:tcPr>
+            <w:tcW w:type="dxa" w:w="1152"/>
+          </w:tcPr>
+          <w:p>
+            <w:pPr>
+              <w:spacing w:after="0"/>
+              <w:jc w:val="center"/>
+            </w:pPr>
+            <w:r>
+              <w:rPr>
+                <w:rFonts w:ascii="Times New Roman" w:hAnsi="Times New Roman"/>
+                <w:b w:val="0"/>
+                <w:sz w:val="15"/>
+              </w:rPr>
+              <w:t>Built, tested</w:t>
+            </w:r>
+          </w:p>
+        </w:tc>
+      </w:tr>
+      <w:tr>
+        <w:tc>
+          <w:tcPr>
+            <w:tcW w:type="dxa" w:w="1296"/>
+          </w:tcPr>
+          <w:p>
+            <w:pPr>
+              <w:spacing w:after="0"/>
+              <w:jc w:val="left"/>
+            </w:pPr>
+            <w:r>
+              <w:rPr>
+                <w:rFonts w:ascii="Times New Roman" w:hAnsi="Times New Roman"/>
+                <w:b w:val="0"/>
+                <w:sz w:val="15"/>
+              </w:rPr>
+              <w:t>Phishing mail asking for action</w:t>
+            </w:r>
+          </w:p>
+        </w:tc>
+        <w:tc>
+          <w:tcPr>
+            <w:tcW w:type="dxa" w:w="2376"/>
+          </w:tcPr>
+          <w:p>
+            <w:pPr>
+              <w:spacing w:after="0"/>
+              <w:jc w:val="center"/>
+            </w:pPr>
+            <w:r>
+              <w:rPr>
+                <w:rFonts w:ascii="Times New Roman" w:hAnsi="Times New Roman"/>
+                <w:b w:val="0"/>
+                <w:sz w:val="15"/>
+              </w:rPr>
+              <w:t>App never sends or clicks; drafts have no recipient</w:t>
+            </w:r>
+          </w:p>
+        </w:tc>
+        <w:tc>
+          <w:tcPr>
+            <w:tcW w:type="dxa" w:w="1152"/>
+          </w:tcPr>
+          <w:p>
+            <w:pPr>
+              <w:spacing w:after="0"/>
+              <w:jc w:val="center"/>
+            </w:pPr>
+            <w:r>
+              <w:rPr>
+                <w:rFonts w:ascii="Times New Roman" w:hAnsi="Times New Roman"/>
+                <w:b w:val="0"/>
+                <w:sz w:val="15"/>
+              </w:rPr>
+              <w:t>Built; sender checks planned</w:t>
+            </w:r>
+          </w:p>
+        </w:tc>
+      </w:tr>
+      <w:tr>
+        <w:tc>
+          <w:tcPr>
+            <w:tcW w:type="dxa" w:w="1296"/>
+          </w:tcPr>
+          <w:p>
+            <w:pPr>
+              <w:spacing w:after="0"/>
+              <w:jc w:val="left"/>
+            </w:pPr>
+            <w:r>
+              <w:rPr>
+                <w:rFonts w:ascii="Times New Roman" w:hAnsi="Times New Roman"/>
+                <w:b w:val="0"/>
+                <w:sz w:val="15"/>
+              </w:rPr>
+              <w:t>Token theft (Gmail)</w:t>
+            </w:r>
+          </w:p>
+        </w:tc>
+        <w:tc>
+          <w:tcPr>
+            <w:tcW w:type="dxa" w:w="2376"/>
+          </w:tcPr>
+          <w:p>
+            <w:pPr>
+              <w:spacing w:after="0"/>
+              <w:jc w:val="center"/>
+            </w:pPr>
+            <w:r>
+              <w:rPr>
+                <w:rFonts w:ascii="Times New Roman" w:hAnsi="Times New Roman"/>
+                <w:b w:val="0"/>
+                <w:sz w:val="15"/>
+              </w:rPr>
+              <w:t>Read-only scope, token file mode 0600, nothing in repo</w:t>
+            </w:r>
+          </w:p>
+        </w:tc>
+        <w:tc>
+          <w:tcPr>
+            <w:tcW w:type="dxa" w:w="1152"/>
+          </w:tcPr>
+          <w:p>
+            <w:pPr>
+              <w:spacing w:after="0"/>
+              <w:jc w:val="center"/>
+            </w:pPr>
+            <w:r>
+              <w:rPr>
+                <w:rFonts w:ascii="Times New Roman" w:hAnsi="Times New Roman"/>
+                <w:b w:val="0"/>
+                <w:sz w:val="15"/>
+              </w:rPr>
+              <w:t>Implemented, not live-tested</w:t>
+            </w:r>
+          </w:p>
+        </w:tc>
+      </w:tr>
+      <w:tr>
+        <w:tc>
+          <w:tcPr>
+            <w:tcW w:type="dxa" w:w="1296"/>
+          </w:tcPr>
+          <w:p>
+            <w:pPr>
+              <w:spacing w:after="0"/>
+              <w:jc w:val="left"/>
+            </w:pPr>
+            <w:r>
+              <w:rPr>
+                <w:rFonts w:ascii="Times New Roman" w:hAnsi="Times New Roman"/>
+                <w:b w:val="0"/>
+                <w:sz w:val="15"/>
+              </w:rPr>
+              <w:t>Injection in a fetched web page</w:t>
+            </w:r>
+          </w:p>
+        </w:tc>
+        <w:tc>
+          <w:tcPr>
+            <w:tcW w:type="dxa" w:w="2376"/>
+          </w:tcPr>
+          <w:p>
+            <w:pPr>
+              <w:spacing w:after="0"/>
+              <w:jc w:val="center"/>
+            </w:pPr>
+            <w:r>
+              <w:rPr>
+                <w:rFonts w:ascii="Times New Roman" w:hAnsi="Times New Roman"/>
+                <w:b w:val="0"/>
+                <w:sz w:val="15"/>
+              </w:rPr>
+              <w:t>Page is data; only listed URLs fetched; no send tool; citations must be verbatim page quotes; private-address block</w:t>
+            </w:r>
+          </w:p>
+        </w:tc>
+        <w:tc>
+          <w:tcPr>
+            <w:tcW w:type="dxa" w:w="1152"/>
+          </w:tcPr>
+          <w:p>
+            <w:pPr>
+              <w:spacing w:after="0"/>
+              <w:jc w:val="center"/>
+            </w:pPr>
+            <w:r>
+              <w:rPr>
+                <w:rFonts w:ascii="Times New Roman" w:hAnsi="Times New Roman"/>
+                <w:b w:val="0"/>
+                <w:sz w:val="15"/>
+              </w:rPr>
+              <w:t>Built, mock-tested; not live-tested</w:t>
+            </w:r>
+          </w:p>
+        </w:tc>
+      </w:tr>
+      <w:tr>
+        <w:tc>
+          <w:tcPr>
+            <w:tcW w:type="dxa" w:w="1296"/>
+          </w:tcPr>
+          <w:p>
+            <w:pPr>
+              <w:spacing w:after="0"/>
+              <w:jc w:val="left"/>
+            </w:pPr>
+            <w:r>
+              <w:rPr>
+                <w:rFonts w:ascii="Times New Roman" w:hAnsi="Times New Roman"/>
+                <w:b w:val="0"/>
+                <w:sz w:val="15"/>
+              </w:rPr>
+              <w:t>Private mail sent to a model</w:t>
+            </w:r>
+          </w:p>
+        </w:tc>
+        <w:tc>
+          <w:tcPr>
+            <w:tcW w:type="dxa" w:w="2376"/>
+          </w:tcPr>
+          <w:p>
+            <w:pPr>
+              <w:spacing w:after="0"/>
+              <w:jc w:val="center"/>
+            </w:pPr>
+            <w:r>
+              <w:rPr>
+                <w:rFonts w:ascii="Times New Roman" w:hAnsi="Times New Roman"/>
+                <w:b w:val="0"/>
+                <w:sz w:val="15"/>
+              </w:rPr>
+              <w:t>Offline by default; model mode is opt-in with the user's own endpoint</w:t>
+            </w:r>
+          </w:p>
+        </w:tc>
+        <w:tc>
+          <w:tcPr>
+            <w:tcW w:type="dxa" w:w="1152"/>
+          </w:tcPr>
+          <w:p>
+            <w:pPr>
+              <w:spacing w:after="0"/>
+              <w:jc w:val="center"/>
+            </w:pPr>
+            <w:r>
+              <w:rPr>
+                <w:rFonts w:ascii="Times New Roman" w:hAnsi="Times New Roman"/>
+                <w:b w:val="0"/>
+                <w:sz w:val="15"/>
+              </w:rPr>
+              <w:t>Built; consent flow planned</w:t>
+            </w:r>
+          </w:p>
+        </w:tc>
+      </w:tr>
+      <w:tr>
+        <w:tc>
+          <w:tcPr>
+            <w:tcW w:type="dxa" w:w="1296"/>
+          </w:tcPr>
+          <w:p>
+            <w:pPr>
+              <w:spacing w:after="0"/>
+              <w:jc w:val="left"/>
+            </w:pPr>
+            <w:r>
+              <w:rPr>
+                <w:rFonts w:ascii="Times New Roman" w:hAnsi="Times New Roman"/>
+                <w:b w:val="0"/>
+                <w:sz w:val="15"/>
+              </w:rPr>
+              <w:t>Over-sending reminders</w:t>
+            </w:r>
+          </w:p>
+        </w:tc>
+        <w:tc>
+          <w:tcPr>
+            <w:tcW w:type="dxa" w:w="2376"/>
+          </w:tcPr>
+          <w:p>
+            <w:pPr>
+              <w:spacing w:after="0"/>
+              <w:jc w:val="center"/>
+            </w:pPr>
+            <w:r>
+              <w:rPr>
+                <w:rFonts w:ascii="Times New Roman" w:hAnsi="Times New Roman"/>
+                <w:b w:val="0"/>
+                <w:sz w:val="15"/>
+              </w:rPr>
+              <w:t>Once per task version and band; dry-run adapters</w:t>
+            </w:r>
+          </w:p>
+        </w:tc>
+        <w:tc>
+          <w:tcPr>
+            <w:tcW w:type="dxa" w:w="1152"/>
+          </w:tcPr>
+          <w:p>
+            <w:pPr>
+              <w:spacing w:after="0"/>
+              <w:jc w:val="center"/>
+            </w:pPr>
+            <w:r>
+              <w:rPr>
+                <w:rFonts w:ascii="Times New Roman" w:hAnsi="Times New Roman"/>
+                <w:b w:val="0"/>
+                <w:sz w:val="15"/>
+              </w:rPr>
+              <w:t>Built, tested</w:t>
+            </w:r>
+          </w:p>
+        </w:tc>
+      </w:tr>
+      <w:tr>
+        <w:tc>
+          <w:tcPr>
+            <w:tcW w:type="dxa" w:w="1296"/>
+          </w:tcPr>
+          <w:p>
+            <w:pPr>
+              <w:spacing w:after="0"/>
+              <w:jc w:val="left"/>
+            </w:pPr>
+            <w:r>
+              <w:rPr>
+                <w:rFonts w:ascii="Times New Roman" w:hAnsi="Times New Roman"/>
+                <w:b w:val="0"/>
+                <w:sz w:val="15"/>
+              </w:rPr>
+              <w:t>Local web page attack</w:t>
+            </w:r>
+          </w:p>
+        </w:tc>
+        <w:tc>
+          <w:tcPr>
+            <w:tcW w:type="dxa" w:w="2376"/>
+          </w:tcPr>
+          <w:p>
+            <w:pPr>
+              <w:spacing w:after="0"/>
+              <w:jc w:val="center"/>
+            </w:pPr>
+            <w:r>
+              <w:rPr>
+                <w:rFonts w:ascii="Times New Roman" w:hAnsi="Times New Roman"/>
+                <w:b w:val="0"/>
+                <w:sz w:val="15"/>
+              </w:rPr>
+              <w:t>Loopback, Host check, write token, CSP</w:t>
+            </w:r>
+          </w:p>
+        </w:tc>
+        <w:tc>
+          <w:tcPr>
+            <w:tcW w:type="dxa" w:w="1152"/>
+          </w:tcPr>
+          <w:p>
+            <w:pPr>
+              <w:spacing w:after="0"/>
+              <w:jc w:val="center"/>
+            </w:pPr>
+            <w:r>
+              <w:rPr>
+                <w:rFonts w:ascii="Times New Roman" w:hAnsi="Times New Roman"/>
+                <w:b w:val="0"/>
+                <w:sz w:val="15"/>
+              </w:rPr>
+              <w:t>Built; not a security audit</w:t>
+            </w:r>
+          </w:p>
+        </w:tc>
+      </w:tr>
+    </w:tbl>
+    <w:p>
+      <w:pPr>
+        <w:spacing w:after="60" w:before="0"/>
+        <w:jc w:val="both"/>
+      </w:pPr>
+    </w:p>
+    <w:p>
+      <w:pPr>
+        <w:spacing w:after="80" w:before="0"/>
+        <w:jc w:val="both"/>
+      </w:pPr>
+      <w:r>
+        <w:rPr>
+          <w:rFonts w:ascii="Times New Roman" w:hAnsi="Times New Roman"/>
+          <w:b w:val="0"/>
+          <w:i w:val="0"/>
+          <w:sz w:val="19"/>
+        </w:rPr>
+        <w:t>Table XV lists risks with the mitigation that exists in code and its status. Nothing here was penetration-tested.</w:t>
+      </w:r>
+    </w:p>
+    <w:p>
+      <w:pPr>
+        <w:spacing w:after="80" w:before="180"/>
+        <w:jc w:val="left"/>
+      </w:pPr>
+      <w:r>
+        <w:rPr>
+          <w:rFonts w:ascii="Times New Roman" w:hAnsi="Times New Roman"/>
+          <w:b/>
+          <w:i w:val="0"/>
+          <w:sz w:val="20"/>
+        </w:rPr>
+        <w:t>X. REAL-WORLD USE</w:t>
       </w:r>
     </w:p>
     <w:p>
@@ -7788,7 +9368,7 @@
           <w:i w:val="0"/>
           <w:sz w:val="20"/>
         </w:rPr>
-        <w:t>X. RELATION TO AGENTIC AI CONCEPTS</w:t>
+        <w:t>XI. RELATION TO AGENTIC AI CONCEPTS</w:t>
       </w:r>
     </w:p>
     <w:p>
@@ -7803,9 +9383,9 @@
           <w:i w:val="0"/>
           <w:sz w:val="17"/>
         </w:rPr>
-        <w:t>TABLE XIV</w:t>
+        <w:t>TABLE XVI</w:t>
         <w:br/>
-        <w:t>CAMPUSINBOX AND COMMON AGENTIC-AI TOPICS</w:t>
+        <w:t>SYLLABUS TOPICS (BCE27PE02) AND STATUS IN CAMPUSINBOX</w:t>
       </w:r>
     </w:p>
     <w:tbl>
@@ -7819,16 +9399,17 @@
           <w:left w:w="40" w:type="dxa"/>
           <w:right w:w="40" w:type="dxa"/>
         </w:tblCellMar>
-        <w:tblW w:w="4823" w:type="dxa"/>
+        <w:tblW w:w="4824" w:type="dxa"/>
       </w:tblPr>
       <w:tblGrid>
-        <w:gridCol w:w="1728"/>
-        <w:gridCol w:w="3096"/>
+        <w:gridCol w:w="1584"/>
+        <w:gridCol w:w="1152"/>
+        <w:gridCol w:w="2088"/>
       </w:tblGrid>
       <w:tr>
         <w:tc>
           <w:tcPr>
-            <w:tcW w:type="dxa" w:w="1728"/>
+            <w:tcW w:type="dxa" w:w="1584"/>
           </w:tcPr>
           <w:p>
             <w:pPr>
@@ -7841,13 +9422,13 @@
                 <w:b/>
                 <w:sz w:val="15"/>
               </w:rPr>
-              <w:t>Concept</w:t>
-            </w:r>
-          </w:p>
-        </w:tc>
-        <w:tc>
-          <w:tcPr>
-            <w:tcW w:type="dxa" w:w="3096"/>
+              <w:t>Unit / topic (BCE27PE02)</w:t>
+            </w:r>
+          </w:p>
+        </w:tc>
+        <w:tc>
+          <w:tcPr>
+            <w:tcW w:type="dxa" w:w="1152"/>
           </w:tcPr>
           <w:p>
             <w:pPr>
@@ -7860,7 +9441,26 @@
                 <w:b/>
                 <w:sz w:val="15"/>
               </w:rPr>
-              <w:t>Where it appears in CampusInbox</w:t>
+              <w:t>Status</w:t>
+            </w:r>
+          </w:p>
+        </w:tc>
+        <w:tc>
+          <w:tcPr>
+            <w:tcW w:type="dxa" w:w="2088"/>
+          </w:tcPr>
+          <w:p>
+            <w:pPr>
+              <w:spacing w:after="0"/>
+              <w:jc w:val="center"/>
+            </w:pPr>
+            <w:r>
+              <w:rPr>
+                <w:rFonts w:ascii="Times New Roman" w:hAnsi="Times New Roman"/>
+                <w:b/>
+                <w:sz w:val="15"/>
+              </w:rPr>
+              <w:t>Where</w:t>
             </w:r>
           </w:p>
         </w:tc>
@@ -7868,7 +9468,7 @@
       <w:tr>
         <w:tc>
           <w:tcPr>
-            <w:tcW w:type="dxa" w:w="1728"/>
+            <w:tcW w:type="dxa" w:w="1584"/>
           </w:tcPr>
           <w:p>
             <w:pPr>
@@ -7881,13 +9481,13 @@
                 <w:b w:val="0"/>
                 <w:sz w:val="15"/>
               </w:rPr>
-              <w:t>Agent loop (perceive, decide, act)</w:t>
-            </w:r>
-          </w:p>
-        </w:tc>
-        <w:tc>
-          <w:tcPr>
-            <w:tcW w:type="dxa" w:w="3096"/>
+              <w:t>I LLM foundations, prompts</w:t>
+            </w:r>
+          </w:p>
+        </w:tc>
+        <w:tc>
+          <w:tcPr>
+            <w:tcW w:type="dxa" w:w="1152"/>
           </w:tcPr>
           <w:p>
             <w:pPr>
@@ -7900,7 +9500,26 @@
                 <w:b w:val="0"/>
                 <w:sz w:val="15"/>
               </w:rPr>
-              <w:t>Mail import, extraction, review gate, reminders</w:t>
+              <w:t>Built, tested</w:t>
+            </w:r>
+          </w:p>
+        </w:tc>
+        <w:tc>
+          <w:tcPr>
+            <w:tcW w:type="dxa" w:w="2088"/>
+          </w:tcPr>
+          <w:p>
+            <w:pPr>
+              <w:spacing w:after="0"/>
+              <w:jc w:val="center"/>
+            </w:pPr>
+            <w:r>
+              <w:rPr>
+                <w:rFonts w:ascii="Times New Roman" w:hAnsi="Times New Roman"/>
+                <w:b w:val="0"/>
+                <w:sz w:val="15"/>
+              </w:rPr>
+              <w:t>Prompted extraction and labelling with documented prompts</w:t>
             </w:r>
           </w:p>
         </w:tc>
@@ -7908,7 +9527,7 @@
       <w:tr>
         <w:tc>
           <w:tcPr>
-            <w:tcW w:type="dxa" w:w="1728"/>
+            <w:tcW w:type="dxa" w:w="1584"/>
           </w:tcPr>
           <w:p>
             <w:pPr>
@@ -7921,13 +9540,13 @@
                 <w:b w:val="0"/>
                 <w:sz w:val="15"/>
               </w:rPr>
-              <w:t>Roles and tools</w:t>
-            </w:r>
-          </w:p>
-        </w:tc>
-        <w:tc>
-          <w:tcPr>
-            <w:tcW w:type="dxa" w:w="3096"/>
+              <w:t>I Retrieval</w:t>
+            </w:r>
+          </w:p>
+        </w:tc>
+        <w:tc>
+          <w:tcPr>
+            <w:tcW w:type="dxa" w:w="1152"/>
           </w:tcPr>
           <w:p>
             <w:pPr>
@@ -7940,7 +9559,26 @@
                 <w:b w:val="0"/>
                 <w:sz w:val="15"/>
               </w:rPr>
-              <w:t>EvidenceExtractor and ActionPlanner roles; tools are import, calendar export, drafts; no send tool</w:t>
+              <w:t>Built, tested</w:t>
+            </w:r>
+          </w:p>
+        </w:tc>
+        <w:tc>
+          <w:tcPr>
+            <w:tcW w:type="dxa" w:w="2088"/>
+          </w:tcPr>
+          <w:p>
+            <w:pPr>
+              <w:spacing w:after="0"/>
+              <w:jc w:val="center"/>
+            </w:pPr>
+            <w:r>
+              <w:rPr>
+                <w:rFonts w:ascii="Times New Roman" w:hAnsi="Times New Roman"/>
+                <w:b w:val="0"/>
+                <w:sz w:val="15"/>
+              </w:rPr>
+              <w:t>BM25 over mails and syllabus; no embeddings</w:t>
             </w:r>
           </w:p>
         </w:tc>
@@ -7948,7 +9586,7 @@
       <w:tr>
         <w:tc>
           <w:tcPr>
-            <w:tcW w:type="dxa" w:w="1728"/>
+            <w:tcW w:type="dxa" w:w="1584"/>
           </w:tcPr>
           <w:p>
             <w:pPr>
@@ -7961,13 +9599,13 @@
                 <w:b w:val="0"/>
                 <w:sz w:val="15"/>
               </w:rPr>
-              <w:t>Planning and memory</w:t>
-            </w:r>
-          </w:p>
-        </w:tc>
-        <w:tc>
-          <w:tcPr>
-            <w:tcW w:type="dxa" w:w="3096"/>
+              <w:t>I ReAct, reasoning</w:t>
+            </w:r>
+          </w:p>
+        </w:tc>
+        <w:tc>
+          <w:tcPr>
+            <w:tcW w:type="dxa" w:w="1152"/>
           </w:tcPr>
           <w:p>
             <w:pPr>
@@ -7980,7 +9618,26 @@
                 <w:b w:val="0"/>
                 <w:sz w:val="15"/>
               </w:rPr>
-              <w:t>Task lifecycle states; SQLite store with audit log; revisions replace old reminders</w:t>
+              <w:t>Built, tested (mock model); evaluated on part of test split</w:t>
+            </w:r>
+          </w:p>
+        </w:tc>
+        <w:tc>
+          <w:tcPr>
+            <w:tcW w:type="dxa" w:w="2088"/>
+          </w:tcPr>
+          <w:p>
+            <w:pPr>
+              <w:spacing w:after="0"/>
+              <w:jc w:val="center"/>
+            </w:pPr>
+            <w:r>
+              <w:rPr>
+                <w:rFonts w:ascii="Times New Roman" w:hAnsi="Times New Roman"/>
+                <w:b w:val="0"/>
+                <w:sz w:val="15"/>
+              </w:rPr>
+              <w:t>Tool loop with step cap</w:t>
             </w:r>
           </w:p>
         </w:tc>
@@ -7988,7 +9645,7 @@
       <w:tr>
         <w:tc>
           <w:tcPr>
-            <w:tcW w:type="dxa" w:w="1728"/>
+            <w:tcW w:type="dxa" w:w="1584"/>
           </w:tcPr>
           <w:p>
             <w:pPr>
@@ -8001,13 +9658,13 @@
                 <w:b w:val="0"/>
                 <w:sz w:val="15"/>
               </w:rPr>
-              <w:t>Reasoning prompts</w:t>
-            </w:r>
-          </w:p>
-        </w:tc>
-        <w:tc>
-          <w:tcPr>
-            <w:tcW w:type="dxa" w:w="3096"/>
+              <w:t>II Tool-use pattern</w:t>
+            </w:r>
+          </w:p>
+        </w:tc>
+        <w:tc>
+          <w:tcPr>
+            <w:tcW w:type="dxa" w:w="1152"/>
           </w:tcPr>
           <w:p>
             <w:pPr>
@@ -8020,7 +9677,26 @@
                 <w:b w:val="0"/>
                 <w:sz w:val="15"/>
               </w:rPr>
-              <w:t>Prompted extraction with a Date-header anchor and JSON output</w:t>
+              <w:t>Built, tested</w:t>
+            </w:r>
+          </w:p>
+        </w:tc>
+        <w:tc>
+          <w:tcPr>
+            <w:tcW w:type="dxa" w:w="2088"/>
+          </w:tcPr>
+          <w:p>
+            <w:pPr>
+              <w:spacing w:after="0"/>
+              <w:jc w:val="center"/>
+            </w:pPr>
+            <w:r>
+              <w:rPr>
+                <w:rFonts w:ascii="Times New Roman" w:hAnsi="Times New Roman"/>
+                <w:b w:val="0"/>
+                <w:sz w:val="15"/>
+              </w:rPr>
+              <w:t>Five read-only tools; web_search/fetch_url mock-tested, off by default</w:t>
             </w:r>
           </w:p>
         </w:tc>
@@ -8028,7 +9704,7 @@
       <w:tr>
         <w:tc>
           <w:tcPr>
-            <w:tcW w:type="dxa" w:w="1728"/>
+            <w:tcW w:type="dxa" w:w="1584"/>
           </w:tcPr>
           <w:p>
             <w:pPr>
@@ -8041,13 +9717,13 @@
                 <w:b w:val="0"/>
                 <w:sz w:val="15"/>
               </w:rPr>
-              <w:t>Verification</w:t>
-            </w:r>
-          </w:p>
-        </w:tc>
-        <w:tc>
-          <w:tcPr>
-            <w:tcW w:type="dxa" w:w="3096"/>
+              <w:t>II Reflection pattern</w:t>
+            </w:r>
+          </w:p>
+        </w:tc>
+        <w:tc>
+          <w:tcPr>
+            <w:tcW w:type="dxa" w:w="1152"/>
           </w:tcPr>
           <w:p>
             <w:pPr>
@@ -8060,7 +9736,26 @@
                 <w:b w:val="0"/>
                 <w:sz w:val="15"/>
               </w:rPr>
-              <w:t>Quote check, rule-model agreement</w:t>
+              <w:t>Built, tested (mock model)</w:t>
+            </w:r>
+          </w:p>
+        </w:tc>
+        <w:tc>
+          <w:tcPr>
+            <w:tcW w:type="dxa" w:w="2088"/>
+          </w:tcPr>
+          <w:p>
+            <w:pPr>
+              <w:spacing w:after="0"/>
+              <w:jc w:val="center"/>
+            </w:pPr>
+            <w:r>
+              <w:rPr>
+                <w:rFonts w:ascii="Times New Roman" w:hAnsi="Times New Roman"/>
+                <w:b w:val="0"/>
+                <w:sz w:val="15"/>
+              </w:rPr>
+              <w:t>One retry after failed quote check</w:t>
             </w:r>
           </w:p>
         </w:tc>
@@ -8068,7 +9763,7 @@
       <w:tr>
         <w:tc>
           <w:tcPr>
-            <w:tcW w:type="dxa" w:w="1728"/>
+            <w:tcW w:type="dxa" w:w="1584"/>
           </w:tcPr>
           <w:p>
             <w:pPr>
@@ -8081,13 +9776,13 @@
                 <w:b w:val="0"/>
                 <w:sz w:val="15"/>
               </w:rPr>
-              <w:t>Human in the loop</w:t>
-            </w:r>
-          </w:p>
-        </w:tc>
-        <w:tc>
-          <w:tcPr>
-            <w:tcW w:type="dxa" w:w="3096"/>
+              <w:t>II Planning</w:t>
+            </w:r>
+          </w:p>
+        </w:tc>
+        <w:tc>
+          <w:tcPr>
+            <w:tcW w:type="dxa" w:w="1152"/>
           </w:tcPr>
           <w:p>
             <w:pPr>
@@ -8100,7 +9795,26 @@
                 <w:b w:val="0"/>
                 <w:sz w:val="15"/>
               </w:rPr>
-              <w:t>One-tap approval before any action</w:t>
+              <w:t>Partly</w:t>
+            </w:r>
+          </w:p>
+        </w:tc>
+        <w:tc>
+          <w:tcPr>
+            <w:tcW w:type="dxa" w:w="2088"/>
+          </w:tcPr>
+          <w:p>
+            <w:pPr>
+              <w:spacing w:after="0"/>
+              <w:jc w:val="center"/>
+            </w:pPr>
+            <w:r>
+              <w:rPr>
+                <w:rFonts w:ascii="Times New Roman" w:hAnsi="Times New Roman"/>
+                <w:b w:val="0"/>
+                <w:sz w:val="15"/>
+              </w:rPr>
+              <w:t>Fixed planner role (reminder bands); no learned planner</w:t>
             </w:r>
           </w:p>
         </w:tc>
@@ -8108,7 +9822,7 @@
       <w:tr>
         <w:tc>
           <w:tcPr>
-            <w:tcW w:type="dxa" w:w="1728"/>
+            <w:tcW w:type="dxa" w:w="1584"/>
           </w:tcPr>
           <w:p>
             <w:pPr>
@@ -8121,13 +9835,13 @@
                 <w:b w:val="0"/>
                 <w:sz w:val="15"/>
               </w:rPr>
-              <w:t>Safety and injection</w:t>
-            </w:r>
-          </w:p>
-        </w:tc>
-        <w:tc>
-          <w:tcPr>
-            <w:tcW w:type="dxa" w:w="3096"/>
+              <w:t>II LangChain, LangGraph, FAISS</w:t>
+            </w:r>
+          </w:p>
+        </w:tc>
+        <w:tc>
+          <w:tcPr>
+            <w:tcW w:type="dxa" w:w="1152"/>
           </w:tcPr>
           <w:p>
             <w:pPr>
@@ -8140,7 +9854,26 @@
                 <w:b w:val="0"/>
                 <w:sz w:val="15"/>
               </w:rPr>
-              <w:t>Mail treated as data; injection test (negative result)</w:t>
+              <w:t>Not used</w:t>
+            </w:r>
+          </w:p>
+        </w:tc>
+        <w:tc>
+          <w:tcPr>
+            <w:tcW w:type="dxa" w:w="2088"/>
+          </w:tcPr>
+          <w:p>
+            <w:pPr>
+              <w:spacing w:after="0"/>
+              <w:jc w:val="center"/>
+            </w:pPr>
+            <w:r>
+              <w:rPr>
+                <w:rFonts w:ascii="Times New Roman" w:hAnsi="Times New Roman"/>
+                <w:b w:val="0"/>
+                <w:sz w:val="15"/>
+              </w:rPr>
+              <w:t>Plain Python; planned comparison</w:t>
             </w:r>
           </w:p>
         </w:tc>
@@ -8148,7 +9881,7 @@
       <w:tr>
         <w:tc>
           <w:tcPr>
-            <w:tcW w:type="dxa" w:w="1728"/>
+            <w:tcW w:type="dxa" w:w="1584"/>
           </w:tcPr>
           <w:p>
             <w:pPr>
@@ -8161,13 +9894,13 @@
                 <w:b w:val="0"/>
                 <w:sz w:val="15"/>
               </w:rPr>
-              <w:t>Evaluation</w:t>
-            </w:r>
-          </w:p>
-        </w:tc>
-        <w:tc>
-          <w:tcPr>
-            <w:tcW w:type="dxa" w:w="3096"/>
+              <w:t>III Multi-agent orchestration, delegation</w:t>
+            </w:r>
+          </w:p>
+        </w:tc>
+        <w:tc>
+          <w:tcPr>
+            <w:tcW w:type="dxa" w:w="1152"/>
           </w:tcPr>
           <w:p>
             <w:pPr>
@@ -8180,7 +9913,321 @@
                 <w:b w:val="0"/>
                 <w:sz w:val="15"/>
               </w:rPr>
-              <w:t>Enron test split, ablations, bootstrap intervals, error analysis</w:t>
+              <w:t>Partly</w:t>
+            </w:r>
+          </w:p>
+        </w:tc>
+        <w:tc>
+          <w:tcPr>
+            <w:tcW w:type="dxa" w:w="2088"/>
+          </w:tcPr>
+          <w:p>
+            <w:pPr>
+              <w:spacing w:after="0"/>
+              <w:jc w:val="center"/>
+            </w:pPr>
+            <w:r>
+              <w:rPr>
+                <w:rFonts w:ascii="Times New Roman" w:hAnsi="Times New Roman"/>
+                <w:b w:val="0"/>
+                <w:sz w:val="15"/>
+              </w:rPr>
+              <w:t>Extractor/Verifier/Planner/Notifier roles with logged messages; fixed, not dynamic</w:t>
+            </w:r>
+          </w:p>
+        </w:tc>
+      </w:tr>
+      <w:tr>
+        <w:tc>
+          <w:tcPr>
+            <w:tcW w:type="dxa" w:w="1584"/>
+          </w:tcPr>
+          <w:p>
+            <w:pPr>
+              <w:spacing w:after="0"/>
+              <w:jc w:val="left"/>
+            </w:pPr>
+            <w:r>
+              <w:rPr>
+                <w:rFonts w:ascii="Times New Roman" w:hAnsi="Times New Roman"/>
+                <w:b w:val="0"/>
+                <w:sz w:val="15"/>
+              </w:rPr>
+              <w:t>III A2A protocols, AgentBench</w:t>
+            </w:r>
+          </w:p>
+        </w:tc>
+        <w:tc>
+          <w:tcPr>
+            <w:tcW w:type="dxa" w:w="1152"/>
+          </w:tcPr>
+          <w:p>
+            <w:pPr>
+              <w:spacing w:after="0"/>
+              <w:jc w:val="center"/>
+            </w:pPr>
+            <w:r>
+              <w:rPr>
+                <w:rFonts w:ascii="Times New Roman" w:hAnsi="Times New Roman"/>
+                <w:b w:val="0"/>
+                <w:sz w:val="15"/>
+              </w:rPr>
+              <w:t>Not implemented</w:t>
+            </w:r>
+          </w:p>
+        </w:tc>
+        <w:tc>
+          <w:tcPr>
+            <w:tcW w:type="dxa" w:w="2088"/>
+          </w:tcPr>
+          <w:p>
+            <w:pPr>
+              <w:spacing w:after="0"/>
+              <w:jc w:val="center"/>
+            </w:pPr>
+            <w:r>
+              <w:rPr>
+                <w:rFonts w:ascii="Times New Roman" w:hAnsi="Times New Roman"/>
+                <w:b w:val="0"/>
+                <w:sz w:val="15"/>
+              </w:rPr>
+              <w:t>Planned</w:t>
+            </w:r>
+          </w:p>
+        </w:tc>
+      </w:tr>
+      <w:tr>
+        <w:tc>
+          <w:tcPr>
+            <w:tcW w:type="dxa" w:w="1584"/>
+          </w:tcPr>
+          <w:p>
+            <w:pPr>
+              <w:spacing w:after="0"/>
+              <w:jc w:val="left"/>
+            </w:pPr>
+            <w:r>
+              <w:rPr>
+                <w:rFonts w:ascii="Times New Roman" w:hAnsi="Times New Roman"/>
+                <w:b w:val="0"/>
+                <w:sz w:val="15"/>
+              </w:rPr>
+              <w:t>IV Evaluation metrics</w:t>
+            </w:r>
+          </w:p>
+        </w:tc>
+        <w:tc>
+          <w:tcPr>
+            <w:tcW w:type="dxa" w:w="1152"/>
+          </w:tcPr>
+          <w:p>
+            <w:pPr>
+              <w:spacing w:after="0"/>
+              <w:jc w:val="center"/>
+            </w:pPr>
+            <w:r>
+              <w:rPr>
+                <w:rFonts w:ascii="Times New Roman" w:hAnsi="Times New Roman"/>
+                <w:b w:val="0"/>
+                <w:sz w:val="15"/>
+              </w:rPr>
+              <w:t>Built, tested</w:t>
+            </w:r>
+          </w:p>
+        </w:tc>
+        <w:tc>
+          <w:tcPr>
+            <w:tcW w:type="dxa" w:w="2088"/>
+          </w:tcPr>
+          <w:p>
+            <w:pPr>
+              <w:spacing w:after="0"/>
+              <w:jc w:val="center"/>
+            </w:pPr>
+            <w:r>
+              <w:rPr>
+                <w:rFonts w:ascii="Times New Roman" w:hAnsi="Times New Roman"/>
+                <w:b w:val="0"/>
+                <w:sz w:val="15"/>
+              </w:rPr>
+              <w:t>P/R/F1, bootstrap, ablations, error analysis</w:t>
+            </w:r>
+          </w:p>
+        </w:tc>
+      </w:tr>
+      <w:tr>
+        <w:tc>
+          <w:tcPr>
+            <w:tcW w:type="dxa" w:w="1584"/>
+          </w:tcPr>
+          <w:p>
+            <w:pPr>
+              <w:spacing w:after="0"/>
+              <w:jc w:val="left"/>
+            </w:pPr>
+            <w:r>
+              <w:rPr>
+                <w:rFonts w:ascii="Times New Roman" w:hAnsi="Times New Roman"/>
+                <w:b w:val="0"/>
+                <w:sz w:val="15"/>
+              </w:rPr>
+              <w:t>IV Alignment, safety, ethics</w:t>
+            </w:r>
+          </w:p>
+        </w:tc>
+        <w:tc>
+          <w:tcPr>
+            <w:tcW w:type="dxa" w:w="1152"/>
+          </w:tcPr>
+          <w:p>
+            <w:pPr>
+              <w:spacing w:after="0"/>
+              <w:jc w:val="center"/>
+            </w:pPr>
+            <w:r>
+              <w:rPr>
+                <w:rFonts w:ascii="Times New Roman" w:hAnsi="Times New Roman"/>
+                <w:b w:val="0"/>
+                <w:sz w:val="15"/>
+              </w:rPr>
+              <w:t>Built, tested</w:t>
+            </w:r>
+          </w:p>
+        </w:tc>
+        <w:tc>
+          <w:tcPr>
+            <w:tcW w:type="dxa" w:w="2088"/>
+          </w:tcPr>
+          <w:p>
+            <w:pPr>
+              <w:spacing w:after="0"/>
+              <w:jc w:val="center"/>
+            </w:pPr>
+            <w:r>
+              <w:rPr>
+                <w:rFonts w:ascii="Times New Roman" w:hAnsi="Times New Roman"/>
+                <w:b w:val="0"/>
+                <w:sz w:val="15"/>
+              </w:rPr>
+              <w:t>Approval gate, injection test, threat model</w:t>
+            </w:r>
+          </w:p>
+        </w:tc>
+      </w:tr>
+      <w:tr>
+        <w:tc>
+          <w:tcPr>
+            <w:tcW w:type="dxa" w:w="1584"/>
+          </w:tcPr>
+          <w:p>
+            <w:pPr>
+              <w:spacing w:after="0"/>
+              <w:jc w:val="left"/>
+            </w:pPr>
+            <w:r>
+              <w:rPr>
+                <w:rFonts w:ascii="Times New Roman" w:hAnsi="Times New Roman"/>
+                <w:b w:val="0"/>
+                <w:sz w:val="15"/>
+              </w:rPr>
+              <w:t>IV Transparency</w:t>
+            </w:r>
+          </w:p>
+        </w:tc>
+        <w:tc>
+          <w:tcPr>
+            <w:tcW w:type="dxa" w:w="1152"/>
+          </w:tcPr>
+          <w:p>
+            <w:pPr>
+              <w:spacing w:after="0"/>
+              <w:jc w:val="center"/>
+            </w:pPr>
+            <w:r>
+              <w:rPr>
+                <w:rFonts w:ascii="Times New Roman" w:hAnsi="Times New Roman"/>
+                <w:b w:val="0"/>
+                <w:sz w:val="15"/>
+              </w:rPr>
+              <w:t>Built, tested</w:t>
+            </w:r>
+          </w:p>
+        </w:tc>
+        <w:tc>
+          <w:tcPr>
+            <w:tcW w:type="dxa" w:w="2088"/>
+          </w:tcPr>
+          <w:p>
+            <w:pPr>
+              <w:spacing w:after="0"/>
+              <w:jc w:val="center"/>
+            </w:pPr>
+            <w:r>
+              <w:rPr>
+                <w:rFonts w:ascii="Times New Roman" w:hAnsi="Times New Roman"/>
+                <w:b w:val="0"/>
+                <w:sz w:val="15"/>
+              </w:rPr>
+              <w:t>Evidence quote, trace, message log</w:t>
+            </w:r>
+          </w:p>
+        </w:tc>
+      </w:tr>
+      <w:tr>
+        <w:tc>
+          <w:tcPr>
+            <w:tcW w:type="dxa" w:w="1584"/>
+          </w:tcPr>
+          <w:p>
+            <w:pPr>
+              <w:spacing w:after="0"/>
+              <w:jc w:val="left"/>
+            </w:pPr>
+            <w:r>
+              <w:rPr>
+                <w:rFonts w:ascii="Times New Roman" w:hAnsi="Times New Roman"/>
+                <w:b w:val="0"/>
+                <w:sz w:val="15"/>
+              </w:rPr>
+              <w:t>IV Governance, multimodal</w:t>
+            </w:r>
+          </w:p>
+        </w:tc>
+        <w:tc>
+          <w:tcPr>
+            <w:tcW w:type="dxa" w:w="1152"/>
+          </w:tcPr>
+          <w:p>
+            <w:pPr>
+              <w:spacing w:after="0"/>
+              <w:jc w:val="center"/>
+            </w:pPr>
+            <w:r>
+              <w:rPr>
+                <w:rFonts w:ascii="Times New Roman" w:hAnsi="Times New Roman"/>
+                <w:b w:val="0"/>
+                <w:sz w:val="15"/>
+              </w:rPr>
+              <w:t>Discussed only</w:t>
+            </w:r>
+          </w:p>
+        </w:tc>
+        <w:tc>
+          <w:tcPr>
+            <w:tcW w:type="dxa" w:w="2088"/>
+          </w:tcPr>
+          <w:p>
+            <w:pPr>
+              <w:spacing w:after="0"/>
+              <w:jc w:val="center"/>
+            </w:pPr>
+            <w:r>
+              <w:rPr>
+                <w:rFonts w:ascii="Times New Roman" w:hAnsi="Times New Roman"/>
+                <w:b w:val="0"/>
+                <w:sz w:val="15"/>
+              </w:rPr>
+              <w:t>Section IX; no multimodal input</w:t>
             </w:r>
           </w:p>
         </w:tc>
@@ -8204,7 +10251,7 @@
           <w:i w:val="0"/>
           <w:sz w:val="19"/>
         </w:rPr>
-        <w:t>Table XIV relates the system to topics usually taught in agentic-AI courses. The mapping is ours and is meant as orientation, not as a statement about any particular syllabus.</w:t>
+        <w:t>Table XVI relates the system to topics usually taught in agentic-AI courses. The topic list is taken from the course syllabus text; the status column is our own assessment.</w:t>
       </w:r>
     </w:p>
     <w:p>
@@ -8219,7 +10266,7 @@
           <w:i w:val="0"/>
           <w:sz w:val="20"/>
         </w:rPr>
-        <w:t>XI. REPRODUCIBILITY</w:t>
+        <w:t>XII. REPRODUCIBILITY</w:t>
       </w:r>
     </w:p>
     <w:p>
@@ -8249,7 +10296,7 @@
           <w:i w:val="0"/>
           <w:sz w:val="20"/>
         </w:rPr>
-        <w:t>XII. CONCLUSION AND FUTURE WORK</w:t>
+        <w:t>XIII. CONCLUSION AND FUTURE WORK</w:t>
       </w:r>
     </w:p>
     <w:p>
@@ -8264,7 +10311,7 @@
           <w:i w:val="0"/>
           <w:sz w:val="19"/>
         </w:rPr>
-        <w:t>CampusInbox keeps a human decision and a verbatim quote between any model and any reminder. On 178 held-out Enron mails with silver labels, a language model raised recall over rules, and a model-rules agreement gate gave 98.3% precision with 24.2% of mails reviewed. A 40-mail injection test shows that deadline text planted by a sender is accepted by every automatic path, so human review remains the only defence. Future work: a human-adjudicated sample of the labels, college mail collected with consent, handling of times of day instead of 23:59, relative-date resolution against the sender's time zone, and defences against planted deadlines such as sender checks and cross-mail consistency.</w:t>
+        <w:t>CampusInbox keeps a human decision and a verbatim quote between any model and any reminder. On 178 held-out Enron mails with silver labels, a language model raised recall over rules, and a model-rules agreement gate gave 98.3% precision with 24.2% of mails reviewed. A 40-mail injection test shows that deadline text planted by a sender is accepted by every automatic path, so human review remains the only defence. The prototype also adds a tool-using extraction loop with a verifier, a syllabus-aware chat and notifier adapters; only the offline parts and mocked-model paths are unit-tested, and live Gmail, WhatsApp, email and web search are untested. Future work (planned, not built): Gmail and Classroom sync tested with real accounts, email, WhatsApp and push reminders, embedding retrieval, a multi-agent planner, a user study, a human-adjudicated sample of the labels, college mail collected with consent, handling of times of day instead of 23:59, relative-date resolution against the sender's time zone, and defences against planted deadlines such as sender checks and cross-mail consistency.</w:t>
       </w:r>
     </w:p>
     <w:p>

</xml_diff>